<commit_message>
Update EN attachment docx.
</commit_message>
<xml_diff>
--- a/EN/modules/ROOT/attachments/ivy_mooncake-technical-whitepaper-v1.0beta1.docx
+++ b/EN/modules/ROOT/attachments/ivy_mooncake-technical-whitepaper-v1.0beta1.docx
@@ -13,7 +13,7 @@
           <w:lang w:val="en-US" w:eastAsia="zh-CN"/>
         </w:rPr>
       </w:pPr>
-      <w:bookmarkStart w:id="0" w:name="_Toc8371"/>
+      <w:bookmarkStart w:id="0" w:name="_Toc14699"/>
       <w:r>
         <w:rPr>
           <w:rFonts w:hint="eastAsia"/>
@@ -69,474 +69,51 @@
             <w:tabs>
               <w:tab w:val="right" w:leader="dot" w:pos="8306"/>
             </w:tabs>
+          </w:pPr>
+          <w:r>
+            <w:fldChar w:fldCharType="begin"/>
+          </w:r>
+          <w:r>
+            <w:instrText xml:space="preserve">TOC \o "1-3" \h \u </w:instrText>
+          </w:r>
+          <w:r>
+            <w:fldChar w:fldCharType="separate"/>
+          </w:r>
+          <w:r>
+            <w:fldChar w:fldCharType="begin"/>
+          </w:r>
+          <w:r>
+            <w:instrText xml:space="preserve"> HYPERLINK \l _Toc14699 </w:instrText>
+          </w:r>
+          <w:r>
+            <w:fldChar w:fldCharType="separate"/>
+          </w:r>
+          <w:r>
             <w:rPr>
-              <w:rFonts w:hint="eastAsia" w:ascii="微软雅黑" w:hAnsi="微软雅黑" w:eastAsia="微软雅黑" w:cs="微软雅黑"/>
-            </w:rPr>
-          </w:pPr>
-          <w:r>
-            <w:fldChar w:fldCharType="begin"/>
-          </w:r>
-          <w:r>
-            <w:instrText xml:space="preserve">TOC \o "1-3" \h \u </w:instrText>
-          </w:r>
-          <w:r>
-            <w:fldChar w:fldCharType="separate"/>
-          </w:r>
-          <w:r>
-            <w:rPr>
-              <w:rFonts w:hint="eastAsia" w:ascii="微软雅黑" w:hAnsi="微软雅黑" w:eastAsia="微软雅黑" w:cs="微软雅黑"/>
-            </w:rPr>
-            <w:fldChar w:fldCharType="begin"/>
-          </w:r>
-          <w:r>
-            <w:rPr>
-              <w:rFonts w:hint="eastAsia" w:ascii="微软雅黑" w:hAnsi="微软雅黑" w:eastAsia="微软雅黑" w:cs="微软雅黑"/>
-            </w:rPr>
-            <w:instrText xml:space="preserve"> HYPERLINK \l _Toc8371 </w:instrText>
-          </w:r>
-          <w:r>
-            <w:rPr>
-              <w:rFonts w:hint="eastAsia" w:ascii="微软雅黑" w:hAnsi="微软雅黑" w:eastAsia="微软雅黑" w:cs="微软雅黑"/>
-            </w:rPr>
-            <w:fldChar w:fldCharType="separate"/>
-          </w:r>
-          <w:r>
-            <w:rPr>
-              <w:rFonts w:hint="eastAsia" w:ascii="微软雅黑" w:hAnsi="微软雅黑" w:eastAsia="微软雅黑" w:cs="微软雅黑"/>
+              <w:rFonts w:hint="eastAsia"/>
               <w:lang w:val="en-US" w:eastAsia="zh-CN"/>
             </w:rPr>
-            <w:t>Ivy_mooncake技术白皮书</w:t>
-          </w:r>
-          <w:r>
-            <w:rPr>
-              <w:rFonts w:hint="eastAsia" w:ascii="微软雅黑" w:hAnsi="微软雅黑" w:eastAsia="微软雅黑" w:cs="微软雅黑"/>
-            </w:rPr>
+            <w:t>ivy_mooncake Technical White Paper</w:t>
+          </w:r>
+          <w:r>
             <w:tab/>
           </w:r>
           <w:r>
-            <w:rPr>
-              <w:rFonts w:hint="eastAsia" w:ascii="微软雅黑" w:hAnsi="微软雅黑" w:eastAsia="微软雅黑" w:cs="微软雅黑"/>
-            </w:rPr>
             <w:fldChar w:fldCharType="begin"/>
           </w:r>
           <w:r>
-            <w:rPr>
-              <w:rFonts w:hint="eastAsia" w:ascii="微软雅黑" w:hAnsi="微软雅黑" w:eastAsia="微软雅黑" w:cs="微软雅黑"/>
-            </w:rPr>
-            <w:instrText xml:space="preserve"> PAGEREF _Toc8371 \h </w:instrText>
-          </w:r>
-          <w:r>
-            <w:rPr>
-              <w:rFonts w:hint="eastAsia" w:ascii="微软雅黑" w:hAnsi="微软雅黑" w:eastAsia="微软雅黑" w:cs="微软雅黑"/>
-            </w:rPr>
+            <w:instrText xml:space="preserve"> PAGEREF _Toc14699 \h </w:instrText>
+          </w:r>
+          <w:r>
             <w:fldChar w:fldCharType="separate"/>
           </w:r>
           <w:r>
-            <w:rPr>
-              <w:rFonts w:hint="eastAsia" w:ascii="微软雅黑" w:hAnsi="微软雅黑" w:eastAsia="微软雅黑" w:cs="微软雅黑"/>
-            </w:rPr>
             <w:t>1</w:t>
           </w:r>
           <w:r>
-            <w:rPr>
-              <w:rFonts w:hint="eastAsia" w:ascii="微软雅黑" w:hAnsi="微软雅黑" w:eastAsia="微软雅黑" w:cs="微软雅黑"/>
-            </w:rPr>
             <w:fldChar w:fldCharType="end"/>
           </w:r>
           <w:r>
-            <w:rPr>
-              <w:rFonts w:hint="eastAsia" w:ascii="微软雅黑" w:hAnsi="微软雅黑" w:eastAsia="微软雅黑" w:cs="微软雅黑"/>
-            </w:rPr>
-            <w:fldChar w:fldCharType="end"/>
-          </w:r>
-        </w:p>
-        <w:p>
-          <w:pPr>
-            <w:pStyle w:val="6"/>
-            <w:tabs>
-              <w:tab w:val="right" w:leader="dot" w:pos="8306"/>
-            </w:tabs>
-            <w:rPr>
-              <w:rFonts w:hint="eastAsia" w:ascii="微软雅黑" w:hAnsi="微软雅黑" w:eastAsia="微软雅黑" w:cs="微软雅黑"/>
-            </w:rPr>
-          </w:pPr>
-          <w:r>
-            <w:rPr>
-              <w:rFonts w:hint="eastAsia" w:ascii="微软雅黑" w:hAnsi="微软雅黑" w:eastAsia="微软雅黑" w:cs="微软雅黑"/>
-            </w:rPr>
-            <w:fldChar w:fldCharType="begin"/>
-          </w:r>
-          <w:r>
-            <w:rPr>
-              <w:rFonts w:hint="eastAsia" w:ascii="微软雅黑" w:hAnsi="微软雅黑" w:eastAsia="微软雅黑" w:cs="微软雅黑"/>
-            </w:rPr>
-            <w:instrText xml:space="preserve"> HYPERLINK \l _Toc21954 </w:instrText>
-          </w:r>
-          <w:r>
-            <w:rPr>
-              <w:rFonts w:hint="eastAsia" w:ascii="微软雅黑" w:hAnsi="微软雅黑" w:eastAsia="微软雅黑" w:cs="微软雅黑"/>
-            </w:rPr>
-            <w:fldChar w:fldCharType="separate"/>
-          </w:r>
-          <w:r>
-            <w:rPr>
-              <w:rFonts w:hint="eastAsia" w:ascii="微软雅黑" w:hAnsi="微软雅黑" w:eastAsia="微软雅黑" w:cs="微软雅黑"/>
-              <w:lang w:val="en-US" w:eastAsia="zh-CN"/>
-            </w:rPr>
-            <w:t>一、 产品定位</w:t>
-          </w:r>
-          <w:r>
-            <w:rPr>
-              <w:rFonts w:hint="eastAsia" w:ascii="微软雅黑" w:hAnsi="微软雅黑" w:eastAsia="微软雅黑" w:cs="微软雅黑"/>
-            </w:rPr>
-            <w:tab/>
-          </w:r>
-          <w:r>
-            <w:rPr>
-              <w:rFonts w:hint="eastAsia" w:ascii="微软雅黑" w:hAnsi="微软雅黑" w:eastAsia="微软雅黑" w:cs="微软雅黑"/>
-            </w:rPr>
-            <w:fldChar w:fldCharType="begin"/>
-          </w:r>
-          <w:r>
-            <w:rPr>
-              <w:rFonts w:hint="eastAsia" w:ascii="微软雅黑" w:hAnsi="微软雅黑" w:eastAsia="微软雅黑" w:cs="微软雅黑"/>
-            </w:rPr>
-            <w:instrText xml:space="preserve"> PAGEREF _Toc21954 \h </w:instrText>
-          </w:r>
-          <w:r>
-            <w:rPr>
-              <w:rFonts w:hint="eastAsia" w:ascii="微软雅黑" w:hAnsi="微软雅黑" w:eastAsia="微软雅黑" w:cs="微软雅黑"/>
-            </w:rPr>
-            <w:fldChar w:fldCharType="separate"/>
-          </w:r>
-          <w:r>
-            <w:rPr>
-              <w:rFonts w:hint="eastAsia" w:ascii="微软雅黑" w:hAnsi="微软雅黑" w:eastAsia="微软雅黑" w:cs="微软雅黑"/>
-            </w:rPr>
-            <w:t>1</w:t>
-          </w:r>
-          <w:r>
-            <w:rPr>
-              <w:rFonts w:hint="eastAsia" w:ascii="微软雅黑" w:hAnsi="微软雅黑" w:eastAsia="微软雅黑" w:cs="微软雅黑"/>
-            </w:rPr>
-            <w:fldChar w:fldCharType="end"/>
-          </w:r>
-          <w:r>
-            <w:rPr>
-              <w:rFonts w:hint="eastAsia" w:ascii="微软雅黑" w:hAnsi="微软雅黑" w:eastAsia="微软雅黑" w:cs="微软雅黑"/>
-            </w:rPr>
-            <w:fldChar w:fldCharType="end"/>
-          </w:r>
-        </w:p>
-        <w:p>
-          <w:pPr>
-            <w:pStyle w:val="6"/>
-            <w:tabs>
-              <w:tab w:val="right" w:leader="dot" w:pos="8306"/>
-            </w:tabs>
-            <w:rPr>
-              <w:rFonts w:hint="eastAsia" w:ascii="微软雅黑" w:hAnsi="微软雅黑" w:eastAsia="微软雅黑" w:cs="微软雅黑"/>
-            </w:rPr>
-          </w:pPr>
-          <w:r>
-            <w:rPr>
-              <w:rFonts w:hint="eastAsia" w:ascii="微软雅黑" w:hAnsi="微软雅黑" w:eastAsia="微软雅黑" w:cs="微软雅黑"/>
-            </w:rPr>
-            <w:fldChar w:fldCharType="begin"/>
-          </w:r>
-          <w:r>
-            <w:rPr>
-              <w:rFonts w:hint="eastAsia" w:ascii="微软雅黑" w:hAnsi="微软雅黑" w:eastAsia="微软雅黑" w:cs="微软雅黑"/>
-            </w:rPr>
-            <w:instrText xml:space="preserve"> HYPERLINK \l _Toc22690 </w:instrText>
-          </w:r>
-          <w:r>
-            <w:rPr>
-              <w:rFonts w:hint="eastAsia" w:ascii="微软雅黑" w:hAnsi="微软雅黑" w:eastAsia="微软雅黑" w:cs="微软雅黑"/>
-            </w:rPr>
-            <w:fldChar w:fldCharType="separate"/>
-          </w:r>
-          <w:r>
-            <w:rPr>
-              <w:rFonts w:hint="eastAsia" w:ascii="微软雅黑" w:hAnsi="微软雅黑" w:eastAsia="微软雅黑" w:cs="微软雅黑"/>
-              <w:lang w:val="en-US" w:eastAsia="zh-CN"/>
-            </w:rPr>
-            <w:t>二、 应用场景</w:t>
-          </w:r>
-          <w:r>
-            <w:rPr>
-              <w:rFonts w:hint="eastAsia" w:ascii="微软雅黑" w:hAnsi="微软雅黑" w:eastAsia="微软雅黑" w:cs="微软雅黑"/>
-            </w:rPr>
-            <w:tab/>
-          </w:r>
-          <w:r>
-            <w:rPr>
-              <w:rFonts w:hint="eastAsia" w:ascii="微软雅黑" w:hAnsi="微软雅黑" w:eastAsia="微软雅黑" w:cs="微软雅黑"/>
-            </w:rPr>
-            <w:fldChar w:fldCharType="begin"/>
-          </w:r>
-          <w:r>
-            <w:rPr>
-              <w:rFonts w:hint="eastAsia" w:ascii="微软雅黑" w:hAnsi="微软雅黑" w:eastAsia="微软雅黑" w:cs="微软雅黑"/>
-            </w:rPr>
-            <w:instrText xml:space="preserve"> PAGEREF _Toc22690 \h </w:instrText>
-          </w:r>
-          <w:r>
-            <w:rPr>
-              <w:rFonts w:hint="eastAsia" w:ascii="微软雅黑" w:hAnsi="微软雅黑" w:eastAsia="微软雅黑" w:cs="微软雅黑"/>
-            </w:rPr>
-            <w:fldChar w:fldCharType="separate"/>
-          </w:r>
-          <w:r>
-            <w:rPr>
-              <w:rFonts w:hint="eastAsia" w:ascii="微软雅黑" w:hAnsi="微软雅黑" w:eastAsia="微软雅黑" w:cs="微软雅黑"/>
-            </w:rPr>
-            <w:t>2</w:t>
-          </w:r>
-          <w:r>
-            <w:rPr>
-              <w:rFonts w:hint="eastAsia" w:ascii="微软雅黑" w:hAnsi="微软雅黑" w:eastAsia="微软雅黑" w:cs="微软雅黑"/>
-            </w:rPr>
-            <w:fldChar w:fldCharType="end"/>
-          </w:r>
-          <w:r>
-            <w:rPr>
-              <w:rFonts w:hint="eastAsia" w:ascii="微软雅黑" w:hAnsi="微软雅黑" w:eastAsia="微软雅黑" w:cs="微软雅黑"/>
-            </w:rPr>
-            <w:fldChar w:fldCharType="end"/>
-          </w:r>
-        </w:p>
-        <w:p>
-          <w:pPr>
-            <w:pStyle w:val="6"/>
-            <w:tabs>
-              <w:tab w:val="right" w:leader="dot" w:pos="8306"/>
-            </w:tabs>
-            <w:rPr>
-              <w:rFonts w:hint="eastAsia" w:ascii="微软雅黑" w:hAnsi="微软雅黑" w:eastAsia="微软雅黑" w:cs="微软雅黑"/>
-            </w:rPr>
-          </w:pPr>
-          <w:r>
-            <w:rPr>
-              <w:rFonts w:hint="eastAsia" w:ascii="微软雅黑" w:hAnsi="微软雅黑" w:eastAsia="微软雅黑" w:cs="微软雅黑"/>
-            </w:rPr>
-            <w:fldChar w:fldCharType="begin"/>
-          </w:r>
-          <w:r>
-            <w:rPr>
-              <w:rFonts w:hint="eastAsia" w:ascii="微软雅黑" w:hAnsi="微软雅黑" w:eastAsia="微软雅黑" w:cs="微软雅黑"/>
-            </w:rPr>
-            <w:instrText xml:space="preserve"> HYPERLINK \l _Toc2633 </w:instrText>
-          </w:r>
-          <w:r>
-            <w:rPr>
-              <w:rFonts w:hint="eastAsia" w:ascii="微软雅黑" w:hAnsi="微软雅黑" w:eastAsia="微软雅黑" w:cs="微软雅黑"/>
-            </w:rPr>
-            <w:fldChar w:fldCharType="separate"/>
-          </w:r>
-          <w:r>
-            <w:rPr>
-              <w:rFonts w:hint="eastAsia" w:ascii="微软雅黑" w:hAnsi="微软雅黑" w:eastAsia="微软雅黑" w:cs="微软雅黑"/>
-              <w:lang w:val="en-US" w:eastAsia="zh-CN"/>
-            </w:rPr>
-            <w:t>三、 产品特点</w:t>
-          </w:r>
-          <w:r>
-            <w:rPr>
-              <w:rFonts w:hint="eastAsia" w:ascii="微软雅黑" w:hAnsi="微软雅黑" w:eastAsia="微软雅黑" w:cs="微软雅黑"/>
-            </w:rPr>
-            <w:tab/>
-          </w:r>
-          <w:r>
-            <w:rPr>
-              <w:rFonts w:hint="eastAsia" w:ascii="微软雅黑" w:hAnsi="微软雅黑" w:eastAsia="微软雅黑" w:cs="微软雅黑"/>
-            </w:rPr>
-            <w:fldChar w:fldCharType="begin"/>
-          </w:r>
-          <w:r>
-            <w:rPr>
-              <w:rFonts w:hint="eastAsia" w:ascii="微软雅黑" w:hAnsi="微软雅黑" w:eastAsia="微软雅黑" w:cs="微软雅黑"/>
-            </w:rPr>
-            <w:instrText xml:space="preserve"> PAGEREF _Toc2633 \h </w:instrText>
-          </w:r>
-          <w:r>
-            <w:rPr>
-              <w:rFonts w:hint="eastAsia" w:ascii="微软雅黑" w:hAnsi="微软雅黑" w:eastAsia="微软雅黑" w:cs="微软雅黑"/>
-            </w:rPr>
-            <w:fldChar w:fldCharType="separate"/>
-          </w:r>
-          <w:r>
-            <w:rPr>
-              <w:rFonts w:hint="eastAsia" w:ascii="微软雅黑" w:hAnsi="微软雅黑" w:eastAsia="微软雅黑" w:cs="微软雅黑"/>
-            </w:rPr>
-            <w:t>3</w:t>
-          </w:r>
-          <w:r>
-            <w:rPr>
-              <w:rFonts w:hint="eastAsia" w:ascii="微软雅黑" w:hAnsi="微软雅黑" w:eastAsia="微软雅黑" w:cs="微软雅黑"/>
-            </w:rPr>
-            <w:fldChar w:fldCharType="end"/>
-          </w:r>
-          <w:r>
-            <w:rPr>
-              <w:rFonts w:hint="eastAsia" w:ascii="微软雅黑" w:hAnsi="微软雅黑" w:eastAsia="微软雅黑" w:cs="微软雅黑"/>
-            </w:rPr>
-            <w:fldChar w:fldCharType="end"/>
-          </w:r>
-        </w:p>
-        <w:p>
-          <w:pPr>
-            <w:pStyle w:val="6"/>
-            <w:tabs>
-              <w:tab w:val="right" w:leader="dot" w:pos="8306"/>
-            </w:tabs>
-            <w:rPr>
-              <w:rFonts w:hint="eastAsia" w:ascii="微软雅黑" w:hAnsi="微软雅黑" w:eastAsia="微软雅黑" w:cs="微软雅黑"/>
-            </w:rPr>
-          </w:pPr>
-          <w:r>
-            <w:rPr>
-              <w:rFonts w:hint="eastAsia" w:ascii="微软雅黑" w:hAnsi="微软雅黑" w:eastAsia="微软雅黑" w:cs="微软雅黑"/>
-            </w:rPr>
-            <w:fldChar w:fldCharType="begin"/>
-          </w:r>
-          <w:r>
-            <w:rPr>
-              <w:rFonts w:hint="eastAsia" w:ascii="微软雅黑" w:hAnsi="微软雅黑" w:eastAsia="微软雅黑" w:cs="微软雅黑"/>
-            </w:rPr>
-            <w:instrText xml:space="preserve"> HYPERLINK \l _Toc9516 </w:instrText>
-          </w:r>
-          <w:r>
-            <w:rPr>
-              <w:rFonts w:hint="eastAsia" w:ascii="微软雅黑" w:hAnsi="微软雅黑" w:eastAsia="微软雅黑" w:cs="微软雅黑"/>
-            </w:rPr>
-            <w:fldChar w:fldCharType="separate"/>
-          </w:r>
-          <w:r>
-            <w:rPr>
-              <w:rFonts w:hint="eastAsia" w:ascii="微软雅黑" w:hAnsi="微软雅黑" w:eastAsia="微软雅黑" w:cs="微软雅黑"/>
-              <w:lang w:val="en-US" w:eastAsia="zh-CN"/>
-            </w:rPr>
-            <w:t>四、 技术架构</w:t>
-          </w:r>
-          <w:r>
-            <w:rPr>
-              <w:rFonts w:hint="eastAsia" w:ascii="微软雅黑" w:hAnsi="微软雅黑" w:eastAsia="微软雅黑" w:cs="微软雅黑"/>
-            </w:rPr>
-            <w:tab/>
-          </w:r>
-          <w:r>
-            <w:rPr>
-              <w:rFonts w:hint="eastAsia" w:ascii="微软雅黑" w:hAnsi="微软雅黑" w:eastAsia="微软雅黑" w:cs="微软雅黑"/>
-            </w:rPr>
-            <w:fldChar w:fldCharType="begin"/>
-          </w:r>
-          <w:r>
-            <w:rPr>
-              <w:rFonts w:hint="eastAsia" w:ascii="微软雅黑" w:hAnsi="微软雅黑" w:eastAsia="微软雅黑" w:cs="微软雅黑"/>
-            </w:rPr>
-            <w:instrText xml:space="preserve"> PAGEREF _Toc9516 \h </w:instrText>
-          </w:r>
-          <w:r>
-            <w:rPr>
-              <w:rFonts w:hint="eastAsia" w:ascii="微软雅黑" w:hAnsi="微软雅黑" w:eastAsia="微软雅黑" w:cs="微软雅黑"/>
-            </w:rPr>
-            <w:fldChar w:fldCharType="separate"/>
-          </w:r>
-          <w:r>
-            <w:rPr>
-              <w:rFonts w:hint="eastAsia" w:ascii="微软雅黑" w:hAnsi="微软雅黑" w:eastAsia="微软雅黑" w:cs="微软雅黑"/>
-            </w:rPr>
-            <w:t>4</w:t>
-          </w:r>
-          <w:r>
-            <w:rPr>
-              <w:rFonts w:hint="eastAsia" w:ascii="微软雅黑" w:hAnsi="微软雅黑" w:eastAsia="微软雅黑" w:cs="微软雅黑"/>
-            </w:rPr>
-            <w:fldChar w:fldCharType="end"/>
-          </w:r>
-          <w:r>
-            <w:rPr>
-              <w:rFonts w:hint="eastAsia" w:ascii="微软雅黑" w:hAnsi="微软雅黑" w:eastAsia="微软雅黑" w:cs="微软雅黑"/>
-            </w:rPr>
-            <w:fldChar w:fldCharType="end"/>
-          </w:r>
-        </w:p>
-        <w:p>
-          <w:pPr>
-            <w:pStyle w:val="6"/>
-            <w:tabs>
-              <w:tab w:val="right" w:leader="dot" w:pos="8306"/>
-            </w:tabs>
-            <w:rPr>
-              <w:rFonts w:hint="eastAsia" w:ascii="微软雅黑" w:hAnsi="微软雅黑" w:eastAsia="微软雅黑" w:cs="微软雅黑"/>
-            </w:rPr>
-          </w:pPr>
-          <w:r>
-            <w:rPr>
-              <w:rFonts w:hint="eastAsia" w:ascii="微软雅黑" w:hAnsi="微软雅黑" w:eastAsia="微软雅黑" w:cs="微软雅黑"/>
-            </w:rPr>
-            <w:fldChar w:fldCharType="begin"/>
-          </w:r>
-          <w:r>
-            <w:rPr>
-              <w:rFonts w:hint="eastAsia" w:ascii="微软雅黑" w:hAnsi="微软雅黑" w:eastAsia="微软雅黑" w:cs="微软雅黑"/>
-            </w:rPr>
-            <w:instrText xml:space="preserve"> HYPERLINK \l _Toc26860 </w:instrText>
-          </w:r>
-          <w:r>
-            <w:rPr>
-              <w:rFonts w:hint="eastAsia" w:ascii="微软雅黑" w:hAnsi="微软雅黑" w:eastAsia="微软雅黑" w:cs="微软雅黑"/>
-            </w:rPr>
-            <w:fldChar w:fldCharType="separate"/>
-          </w:r>
-          <w:r>
-            <w:rPr>
-              <w:rFonts w:hint="eastAsia" w:ascii="微软雅黑" w:hAnsi="微软雅黑" w:eastAsia="微软雅黑" w:cs="微软雅黑"/>
-              <w:lang w:val="en-US" w:eastAsia="zh-CN"/>
-            </w:rPr>
-            <w:t>五、 部署形态</w:t>
-          </w:r>
-          <w:r>
-            <w:rPr>
-              <w:rFonts w:hint="eastAsia" w:ascii="微软雅黑" w:hAnsi="微软雅黑" w:eastAsia="微软雅黑" w:cs="微软雅黑"/>
-            </w:rPr>
-            <w:tab/>
-          </w:r>
-          <w:r>
-            <w:rPr>
-              <w:rFonts w:hint="eastAsia" w:ascii="微软雅黑" w:hAnsi="微软雅黑" w:eastAsia="微软雅黑" w:cs="微软雅黑"/>
-            </w:rPr>
-            <w:fldChar w:fldCharType="begin"/>
-          </w:r>
-          <w:r>
-            <w:rPr>
-              <w:rFonts w:hint="eastAsia" w:ascii="微软雅黑" w:hAnsi="微软雅黑" w:eastAsia="微软雅黑" w:cs="微软雅黑"/>
-            </w:rPr>
-            <w:instrText xml:space="preserve"> PAGEREF _Toc26860 \h </w:instrText>
-          </w:r>
-          <w:r>
-            <w:rPr>
-              <w:rFonts w:hint="eastAsia" w:ascii="微软雅黑" w:hAnsi="微软雅黑" w:eastAsia="微软雅黑" w:cs="微软雅黑"/>
-            </w:rPr>
-            <w:fldChar w:fldCharType="separate"/>
-          </w:r>
-          <w:r>
-            <w:rPr>
-              <w:rFonts w:hint="eastAsia" w:ascii="微软雅黑" w:hAnsi="微软雅黑" w:eastAsia="微软雅黑" w:cs="微软雅黑"/>
-            </w:rPr>
-            <w:t>6</w:t>
-          </w:r>
-          <w:r>
-            <w:rPr>
-              <w:rFonts w:hint="eastAsia" w:ascii="微软雅黑" w:hAnsi="微软雅黑" w:eastAsia="微软雅黑" w:cs="微软雅黑"/>
-            </w:rPr>
-            <w:fldChar w:fldCharType="end"/>
-          </w:r>
-          <w:r>
-            <w:rPr>
-              <w:rFonts w:hint="eastAsia" w:ascii="微软雅黑" w:hAnsi="微软雅黑" w:eastAsia="微软雅黑" w:cs="微软雅黑"/>
-            </w:rPr>
             <w:fldChar w:fldCharType="end"/>
           </w:r>
         </w:p>
@@ -548,21 +125,12 @@
             </w:tabs>
           </w:pPr>
           <w:r>
-            <w:rPr>
-              <w:rFonts w:hint="eastAsia" w:ascii="微软雅黑" w:hAnsi="微软雅黑" w:eastAsia="微软雅黑" w:cs="微软雅黑"/>
-            </w:rPr>
             <w:fldChar w:fldCharType="begin"/>
           </w:r>
           <w:r>
-            <w:rPr>
-              <w:rFonts w:hint="eastAsia" w:ascii="微软雅黑" w:hAnsi="微软雅黑" w:eastAsia="微软雅黑" w:cs="微软雅黑"/>
-            </w:rPr>
-            <w:instrText xml:space="preserve"> HYPERLINK \l _Toc13478 </w:instrText>
-          </w:r>
-          <w:r>
-            <w:rPr>
-              <w:rFonts w:hint="eastAsia" w:ascii="微软雅黑" w:hAnsi="微软雅黑" w:eastAsia="微软雅黑" w:cs="微软雅黑"/>
-            </w:rPr>
+            <w:instrText xml:space="preserve"> HYPERLINK \l _Toc22444 </w:instrText>
+          </w:r>
+          <w:r>
             <w:fldChar w:fldCharType="separate"/>
           </w:r>
           <w:r>
@@ -570,48 +138,252 @@
               <w:rFonts w:hint="eastAsia" w:ascii="微软雅黑" w:hAnsi="微软雅黑" w:eastAsia="微软雅黑" w:cs="微软雅黑"/>
               <w:lang w:val="en-US" w:eastAsia="zh-CN"/>
             </w:rPr>
+            <w:t>1. Product Positioning</w:t>
+          </w:r>
+          <w:r>
+            <w:tab/>
+          </w:r>
+          <w:r>
+            <w:fldChar w:fldCharType="begin"/>
+          </w:r>
+          <w:r>
+            <w:instrText xml:space="preserve"> PAGEREF _Toc22444 \h </w:instrText>
+          </w:r>
+          <w:r>
+            <w:fldChar w:fldCharType="separate"/>
+          </w:r>
+          <w:r>
+            <w:t>1</w:t>
+          </w:r>
+          <w:r>
+            <w:fldChar w:fldCharType="end"/>
+          </w:r>
+          <w:r>
+            <w:fldChar w:fldCharType="end"/>
+          </w:r>
+        </w:p>
+        <w:p>
+          <w:pPr>
+            <w:pStyle w:val="6"/>
+            <w:tabs>
+              <w:tab w:val="right" w:leader="dot" w:pos="8306"/>
+            </w:tabs>
+          </w:pPr>
+          <w:r>
+            <w:fldChar w:fldCharType="begin"/>
+          </w:r>
+          <w:r>
+            <w:instrText xml:space="preserve"> HYPERLINK \l _Toc20672 </w:instrText>
+          </w:r>
+          <w:r>
+            <w:fldChar w:fldCharType="separate"/>
+          </w:r>
+          <w:r>
+            <w:rPr>
+              <w:rFonts w:hint="eastAsia"/>
+              <w:lang w:val="en-US" w:eastAsia="zh-CN"/>
+            </w:rPr>
+            <w:t>二、 Use Cases</w:t>
+          </w:r>
+          <w:r>
+            <w:tab/>
+          </w:r>
+          <w:r>
+            <w:fldChar w:fldCharType="begin"/>
+          </w:r>
+          <w:r>
+            <w:instrText xml:space="preserve"> PAGEREF _Toc20672 \h </w:instrText>
+          </w:r>
+          <w:r>
+            <w:fldChar w:fldCharType="separate"/>
+          </w:r>
+          <w:r>
+            <w:t>2</w:t>
+          </w:r>
+          <w:r>
+            <w:fldChar w:fldCharType="end"/>
+          </w:r>
+          <w:r>
+            <w:fldChar w:fldCharType="end"/>
+          </w:r>
+        </w:p>
+        <w:p>
+          <w:pPr>
+            <w:pStyle w:val="6"/>
+            <w:tabs>
+              <w:tab w:val="right" w:leader="dot" w:pos="8306"/>
+            </w:tabs>
+          </w:pPr>
+          <w:r>
+            <w:fldChar w:fldCharType="begin"/>
+          </w:r>
+          <w:r>
+            <w:instrText xml:space="preserve"> HYPERLINK \l _Toc16940 </w:instrText>
+          </w:r>
+          <w:r>
+            <w:fldChar w:fldCharType="separate"/>
+          </w:r>
+          <w:r>
+            <w:rPr>
+              <w:rFonts w:hint="eastAsia"/>
+              <w:lang w:val="en-US" w:eastAsia="zh-CN"/>
+            </w:rPr>
+            <w:t>三、 Product Features</w:t>
+          </w:r>
+          <w:r>
+            <w:tab/>
+          </w:r>
+          <w:r>
+            <w:fldChar w:fldCharType="begin"/>
+          </w:r>
+          <w:r>
+            <w:instrText xml:space="preserve"> PAGEREF _Toc16940 \h </w:instrText>
+          </w:r>
+          <w:r>
+            <w:fldChar w:fldCharType="separate"/>
+          </w:r>
+          <w:r>
+            <w:t>4</w:t>
+          </w:r>
+          <w:r>
+            <w:fldChar w:fldCharType="end"/>
+          </w:r>
+          <w:r>
+            <w:fldChar w:fldCharType="end"/>
+          </w:r>
+        </w:p>
+        <w:p>
+          <w:pPr>
+            <w:pStyle w:val="6"/>
+            <w:tabs>
+              <w:tab w:val="right" w:leader="dot" w:pos="8306"/>
+            </w:tabs>
+          </w:pPr>
+          <w:r>
+            <w:fldChar w:fldCharType="begin"/>
+          </w:r>
+          <w:r>
+            <w:instrText xml:space="preserve"> HYPERLINK \l _Toc3936 </w:instrText>
+          </w:r>
+          <w:r>
+            <w:fldChar w:fldCharType="separate"/>
+          </w:r>
+          <w:r>
+            <w:rPr>
+              <w:rFonts w:hint="eastAsia"/>
+              <w:lang w:val="en-US" w:eastAsia="zh-CN"/>
+            </w:rPr>
+            <w:t>四、 Technical Architecture</w:t>
+          </w:r>
+          <w:r>
+            <w:tab/>
+          </w:r>
+          <w:r>
+            <w:fldChar w:fldCharType="begin"/>
+          </w:r>
+          <w:r>
+            <w:instrText xml:space="preserve"> PAGEREF _Toc3936 \h </w:instrText>
+          </w:r>
+          <w:r>
+            <w:fldChar w:fldCharType="separate"/>
+          </w:r>
+          <w:r>
+            <w:t>5</w:t>
+          </w:r>
+          <w:r>
+            <w:fldChar w:fldCharType="end"/>
+          </w:r>
+          <w:r>
+            <w:fldChar w:fldCharType="end"/>
+          </w:r>
+        </w:p>
+        <w:p>
+          <w:pPr>
+            <w:pStyle w:val="6"/>
+            <w:tabs>
+              <w:tab w:val="right" w:leader="dot" w:pos="8306"/>
+            </w:tabs>
+          </w:pPr>
+          <w:r>
+            <w:fldChar w:fldCharType="begin"/>
+          </w:r>
+          <w:r>
+            <w:instrText xml:space="preserve"> HYPERLINK \l _Toc23813 </w:instrText>
+          </w:r>
+          <w:r>
+            <w:fldChar w:fldCharType="separate"/>
+          </w:r>
+          <w:r>
+            <w:rPr>
+              <w:rFonts w:hint="eastAsia"/>
+              <w:lang w:val="en-US" w:eastAsia="zh-CN"/>
+            </w:rPr>
+            <w:t>五、 Deployment Forms</w:t>
+          </w:r>
+          <w:r>
+            <w:tab/>
+          </w:r>
+          <w:r>
+            <w:fldChar w:fldCharType="begin"/>
+          </w:r>
+          <w:r>
+            <w:instrText xml:space="preserve"> PAGEREF _Toc23813 \h </w:instrText>
+          </w:r>
+          <w:r>
+            <w:fldChar w:fldCharType="separate"/>
+          </w:r>
+          <w:r>
+            <w:t>7</w:t>
+          </w:r>
+          <w:r>
+            <w:fldChar w:fldCharType="end"/>
+          </w:r>
+          <w:r>
+            <w:fldChar w:fldCharType="end"/>
+          </w:r>
+        </w:p>
+        <w:p>
+          <w:pPr>
+            <w:pStyle w:val="6"/>
+            <w:tabs>
+              <w:tab w:val="right" w:leader="dot" w:pos="8306"/>
+            </w:tabs>
+          </w:pPr>
+          <w:r>
+            <w:fldChar w:fldCharType="begin"/>
+          </w:r>
+          <w:r>
+            <w:instrText xml:space="preserve"> HYPERLINK \l _Toc18248 </w:instrText>
+          </w:r>
+          <w:r>
+            <w:fldChar w:fldCharType="separate"/>
+          </w:r>
+          <w:r>
+            <w:rPr>
+              <w:rFonts w:hint="eastAsia"/>
+              <w:lang w:val="en-US" w:eastAsia="zh-CN"/>
+            </w:rPr>
             <w:t>六、 Roadmap</w:t>
           </w:r>
           <w:r>
-            <w:rPr>
-              <w:rFonts w:hint="eastAsia" w:ascii="微软雅黑" w:hAnsi="微软雅黑" w:eastAsia="微软雅黑" w:cs="微软雅黑"/>
-            </w:rPr>
             <w:tab/>
           </w:r>
           <w:r>
-            <w:rPr>
-              <w:rFonts w:hint="eastAsia" w:ascii="微软雅黑" w:hAnsi="微软雅黑" w:eastAsia="微软雅黑" w:cs="微软雅黑"/>
-            </w:rPr>
             <w:fldChar w:fldCharType="begin"/>
           </w:r>
           <w:r>
-            <w:rPr>
-              <w:rFonts w:hint="eastAsia" w:ascii="微软雅黑" w:hAnsi="微软雅黑" w:eastAsia="微软雅黑" w:cs="微软雅黑"/>
-            </w:rPr>
-            <w:instrText xml:space="preserve"> PAGEREF _Toc13478 \h </w:instrText>
-          </w:r>
-          <w:r>
-            <w:rPr>
-              <w:rFonts w:hint="eastAsia" w:ascii="微软雅黑" w:hAnsi="微软雅黑" w:eastAsia="微软雅黑" w:cs="微软雅黑"/>
-            </w:rPr>
+            <w:instrText xml:space="preserve"> PAGEREF _Toc18248 \h </w:instrText>
+          </w:r>
+          <w:r>
             <w:fldChar w:fldCharType="separate"/>
           </w:r>
           <w:r>
-            <w:rPr>
-              <w:rFonts w:hint="eastAsia" w:ascii="微软雅黑" w:hAnsi="微软雅黑" w:eastAsia="微软雅黑" w:cs="微软雅黑"/>
-            </w:rPr>
-            <w:t>7</w:t>
-          </w:r>
-          <w:r>
-            <w:rPr>
-              <w:rFonts w:hint="eastAsia" w:ascii="微软雅黑" w:hAnsi="微软雅黑" w:eastAsia="微软雅黑" w:cs="微软雅黑"/>
-            </w:rPr>
+            <w:t>9</w:t>
+          </w:r>
+          <w:r>
             <w:fldChar w:fldCharType="end"/>
           </w:r>
           <w:r>
-            <w:rPr>
-              <w:rFonts w:hint="eastAsia" w:ascii="微软雅黑" w:hAnsi="微软雅黑" w:eastAsia="微软雅黑" w:cs="微软雅黑"/>
-            </w:rPr>
             <w:fldChar w:fldCharType="end"/>
           </w:r>
         </w:p>
@@ -639,7 +411,7 @@
           <w:lang w:val="en-US" w:eastAsia="zh-CN"/>
         </w:rPr>
       </w:pPr>
-      <w:bookmarkStart w:id="1" w:name="_Toc21954"/>
+      <w:bookmarkStart w:id="1" w:name="_Toc22444"/>
       <w:r>
         <w:rPr>
           <w:rFonts w:hint="eastAsia" w:ascii="微软雅黑" w:hAnsi="微软雅黑" w:eastAsia="微软雅黑" w:cs="微软雅黑"/>
@@ -834,7 +606,7 @@
           <w:lang w:val="en-US" w:eastAsia="zh-CN"/>
         </w:rPr>
       </w:pPr>
-      <w:bookmarkStart w:id="2" w:name="_Toc22690"/>
+      <w:bookmarkStart w:id="2" w:name="_Toc20672"/>
       <w:r>
         <w:rPr>
           <w:rFonts w:hint="eastAsia"/>
@@ -867,6 +639,7 @@
     <w:p>
       <w:pPr>
         <w:numPr>
+          <w:ilvl w:val="0"/>
           <w:numId w:val="0"/>
         </w:numPr>
         <w:rPr>
@@ -885,6 +658,7 @@
     <w:p>
       <w:pPr>
         <w:numPr>
+          <w:ilvl w:val="0"/>
           <w:numId w:val="0"/>
         </w:numPr>
         <w:rPr>
@@ -916,6 +690,7 @@
     <w:p>
       <w:pPr>
         <w:numPr>
+          <w:ilvl w:val="0"/>
           <w:numId w:val="0"/>
         </w:numPr>
         <w:rPr>
@@ -934,6 +709,7 @@
     <w:p>
       <w:pPr>
         <w:numPr>
+          <w:ilvl w:val="0"/>
           <w:numId w:val="0"/>
         </w:numPr>
         <w:rPr>
@@ -965,6 +741,7 @@
     <w:p>
       <w:pPr>
         <w:numPr>
+          <w:ilvl w:val="0"/>
           <w:numId w:val="0"/>
         </w:numPr>
         <w:rPr>
@@ -983,6 +760,7 @@
     <w:p>
       <w:pPr>
         <w:numPr>
+          <w:ilvl w:val="0"/>
           <w:numId w:val="0"/>
         </w:numPr>
         <w:rPr>
@@ -1014,6 +792,7 @@
     <w:p>
       <w:pPr>
         <w:numPr>
+          <w:ilvl w:val="0"/>
           <w:numId w:val="0"/>
         </w:numPr>
         <w:rPr>
@@ -1032,6 +811,7 @@
     <w:p>
       <w:pPr>
         <w:numPr>
+          <w:ilvl w:val="0"/>
           <w:numId w:val="0"/>
         </w:numPr>
         <w:rPr>
@@ -1054,7 +834,7 @@
           <w:lang w:val="en-US" w:eastAsia="zh-CN"/>
         </w:rPr>
       </w:pPr>
-      <w:bookmarkStart w:id="3" w:name="_Toc2633"/>
+      <w:bookmarkStart w:id="3" w:name="_Toc16940"/>
       <w:r>
         <w:rPr>
           <w:rFonts w:hint="eastAsia"/>
@@ -1068,6 +848,7 @@
       <w:pPr>
         <w:widowControl w:val="0"/>
         <w:numPr>
+          <w:ilvl w:val="0"/>
           <w:numId w:val="0"/>
         </w:numPr>
         <w:jc w:val="both"/>
@@ -1088,6 +869,7 @@
       <w:pPr>
         <w:widowControl w:val="0"/>
         <w:numPr>
+          <w:ilvl w:val="0"/>
           <w:numId w:val="0"/>
         </w:numPr>
         <w:jc w:val="both"/>
@@ -1123,6 +905,7 @@
       <w:pPr>
         <w:widowControl w:val="0"/>
         <w:numPr>
+          <w:ilvl w:val="0"/>
           <w:numId w:val="0"/>
         </w:numPr>
         <w:jc w:val="both"/>
@@ -1143,6 +926,7 @@
       <w:pPr>
         <w:widowControl w:val="0"/>
         <w:numPr>
+          <w:ilvl w:val="0"/>
           <w:numId w:val="0"/>
         </w:numPr>
         <w:jc w:val="both"/>
@@ -1163,6 +947,7 @@
       <w:pPr>
         <w:widowControl w:val="0"/>
         <w:numPr>
+          <w:ilvl w:val="0"/>
           <w:numId w:val="0"/>
         </w:numPr>
         <w:jc w:val="both"/>
@@ -1183,6 +968,7 @@
       <w:pPr>
         <w:widowControl w:val="0"/>
         <w:numPr>
+          <w:ilvl w:val="0"/>
           <w:numId w:val="0"/>
         </w:numPr>
         <w:jc w:val="both"/>
@@ -1218,6 +1004,7 @@
       <w:pPr>
         <w:widowControl w:val="0"/>
         <w:numPr>
+          <w:ilvl w:val="0"/>
           <w:numId w:val="0"/>
         </w:numPr>
         <w:jc w:val="both"/>
@@ -1238,6 +1025,7 @@
       <w:pPr>
         <w:widowControl w:val="0"/>
         <w:numPr>
+          <w:ilvl w:val="0"/>
           <w:numId w:val="0"/>
         </w:numPr>
         <w:jc w:val="both"/>
@@ -1258,6 +1046,7 @@
       <w:pPr>
         <w:widowControl w:val="0"/>
         <w:numPr>
+          <w:ilvl w:val="0"/>
           <w:numId w:val="0"/>
         </w:numPr>
         <w:jc w:val="both"/>
@@ -1281,7 +1070,6 @@
           <w:lang w:val="en-US" w:eastAsia="zh-CN"/>
         </w:rPr>
       </w:pPr>
-      <w:bookmarkStart w:id="7" w:name="_GoBack"/>
       <w:r>
         <w:rPr>
           <w:rFonts w:hint="eastAsia" w:ascii="微软雅黑" w:hAnsi="微软雅黑" w:eastAsia="微软雅黑" w:cs="微软雅黑"/>
@@ -1290,11 +1078,11 @@
         <w:t>Open lakehouse format</w:t>
       </w:r>
     </w:p>
-    <w:bookmarkEnd w:id="7"/>
     <w:p>
       <w:pPr>
         <w:widowControl w:val="0"/>
         <w:numPr>
+          <w:ilvl w:val="0"/>
           <w:numId w:val="0"/>
         </w:numPr>
         <w:jc w:val="both"/>
@@ -1315,6 +1103,7 @@
       <w:pPr>
         <w:widowControl w:val="0"/>
         <w:numPr>
+          <w:ilvl w:val="0"/>
           <w:numId w:val="0"/>
         </w:numPr>
         <w:jc w:val="both"/>
@@ -1335,6 +1124,7 @@
       <w:pPr>
         <w:widowControl w:val="0"/>
         <w:numPr>
+          <w:ilvl w:val="0"/>
           <w:numId w:val="0"/>
         </w:numPr>
         <w:jc w:val="both"/>
@@ -1370,6 +1160,7 @@
       <w:pPr>
         <w:widowControl w:val="0"/>
         <w:numPr>
+          <w:ilvl w:val="0"/>
           <w:numId w:val="0"/>
         </w:numPr>
         <w:jc w:val="both"/>
@@ -1390,6 +1181,7 @@
       <w:pPr>
         <w:widowControl w:val="0"/>
         <w:numPr>
+          <w:ilvl w:val="0"/>
           <w:numId w:val="0"/>
         </w:numPr>
         <w:jc w:val="both"/>
@@ -1410,6 +1202,7 @@
       <w:pPr>
         <w:widowControl w:val="0"/>
         <w:numPr>
+          <w:ilvl w:val="0"/>
           <w:numId w:val="0"/>
         </w:numPr>
         <w:jc w:val="both"/>
@@ -1433,7 +1226,7 @@
           <w:lang w:val="en-US" w:eastAsia="zh-CN"/>
         </w:rPr>
       </w:pPr>
-      <w:bookmarkStart w:id="4" w:name="_Toc9516"/>
+      <w:bookmarkStart w:id="4" w:name="_Toc3936"/>
       <w:r>
         <w:rPr>
           <w:rFonts w:hint="eastAsia"/>
@@ -1447,6 +1240,7 @@
       <w:pPr>
         <w:widowControl w:val="0"/>
         <w:numPr>
+          <w:ilvl w:val="0"/>
           <w:numId w:val="0"/>
         </w:numPr>
         <w:jc w:val="both"/>
@@ -1467,6 +1261,7 @@
       <w:pPr>
         <w:widowControl w:val="0"/>
         <w:numPr>
+          <w:ilvl w:val="0"/>
           <w:numId w:val="0"/>
         </w:numPr>
         <w:jc w:val="both"/>
@@ -1480,6 +1275,7 @@
       <w:pPr>
         <w:widowControl w:val="0"/>
         <w:numPr>
+          <w:ilvl w:val="0"/>
           <w:numId w:val="0"/>
         </w:numPr>
         <w:jc w:val="both"/>
@@ -1500,6 +1296,7 @@
       <w:pPr>
         <w:widowControl w:val="0"/>
         <w:numPr>
+          <w:ilvl w:val="0"/>
           <w:numId w:val="0"/>
         </w:numPr>
         <w:jc w:val="both"/>
@@ -1508,49 +1305,8 @@
           <w:lang w:val="en-US" w:eastAsia="zh-CN"/>
         </w:rPr>
       </w:pPr>
-      <w:r>
-        <w:drawing>
-          <wp:inline distT="0" distB="0" distL="114300" distR="114300">
-            <wp:extent cx="5270500" cy="4306570"/>
-            <wp:effectExtent l="0" t="0" r="6350" b="17780"/>
-            <wp:docPr id="1" name="图片 1"/>
-            <wp:cNvGraphicFramePr>
-              <a:graphicFrameLocks xmlns:a="http://schemas.openxmlformats.org/drawingml/2006/main" noChangeAspect="1"/>
-            </wp:cNvGraphicFramePr>
-            <a:graphic xmlns:a="http://schemas.openxmlformats.org/drawingml/2006/main">
-              <a:graphicData uri="http://schemas.openxmlformats.org/drawingml/2006/picture">
-                <pic:pic xmlns:pic="http://schemas.openxmlformats.org/drawingml/2006/picture">
-                  <pic:nvPicPr>
-                    <pic:cNvPr id="1" name="图片 1"/>
-                    <pic:cNvPicPr>
-                      <a:picLocks noChangeAspect="1"/>
-                    </pic:cNvPicPr>
-                  </pic:nvPicPr>
-                  <pic:blipFill>
-                    <a:blip r:embed="rId4"/>
-                    <a:stretch>
-                      <a:fillRect/>
-                    </a:stretch>
-                  </pic:blipFill>
-                  <pic:spPr>
-                    <a:xfrm>
-                      <a:off x="0" y="0"/>
-                      <a:ext cx="5270500" cy="4306570"/>
-                    </a:xfrm>
-                    <a:prstGeom prst="rect">
-                      <a:avLst/>
-                    </a:prstGeom>
-                    <a:noFill/>
-                    <a:ln>
-                      <a:noFill/>
-                    </a:ln>
-                  </pic:spPr>
-                </pic:pic>
-              </a:graphicData>
-            </a:graphic>
-          </wp:inline>
-        </w:drawing>
-      </w:r>
+      <w:bookmarkStart w:id="7" w:name="_GoBack"/>
+      <w:bookmarkEnd w:id="7"/>
     </w:p>
     <w:tbl>
       <w:tblPr>
@@ -1567,7 +1323,9 @@
         </w:tblBorders>
         <w:tblLayout w:type="autofit"/>
         <w:tblCellMar>
+          <w:top w:w="0" w:type="dxa"/>
           <w:left w:w="108" w:type="dxa"/>
+          <w:bottom w:w="0" w:type="dxa"/>
           <w:right w:w="108" w:type="dxa"/>
         </w:tblCellMar>
       </w:tblPr>
@@ -1586,7 +1344,9 @@
             <w:insideV w:val="single" w:color="auto" w:sz="4" w:space="0"/>
           </w:tblBorders>
           <w:tblCellMar>
+            <w:top w:w="0" w:type="dxa"/>
             <w:left w:w="108" w:type="dxa"/>
+            <w:bottom w:w="0" w:type="dxa"/>
             <w:right w:w="108" w:type="dxa"/>
           </w:tblCellMar>
         </w:tblPrEx>
@@ -1598,6 +1358,7 @@
             <w:pPr>
               <w:widowControl w:val="0"/>
               <w:numPr>
+                <w:ilvl w:val="0"/>
                 <w:numId w:val="0"/>
               </w:numPr>
               <w:jc w:val="both"/>
@@ -1625,6 +1386,7 @@
             <w:pPr>
               <w:widowControl w:val="0"/>
               <w:numPr>
+                <w:ilvl w:val="0"/>
                 <w:numId w:val="0"/>
               </w:numPr>
               <w:jc w:val="both"/>
@@ -1656,7 +1418,9 @@
             <w:insideV w:val="single" w:color="auto" w:sz="4" w:space="0"/>
           </w:tblBorders>
           <w:tblCellMar>
+            <w:top w:w="0" w:type="dxa"/>
             <w:left w:w="108" w:type="dxa"/>
+            <w:bottom w:w="0" w:type="dxa"/>
             <w:right w:w="108" w:type="dxa"/>
           </w:tblCellMar>
         </w:tblPrEx>
@@ -1668,6 +1432,7 @@
             <w:pPr>
               <w:widowControl w:val="0"/>
               <w:numPr>
+                <w:ilvl w:val="0"/>
                 <w:numId w:val="0"/>
               </w:numPr>
               <w:jc w:val="both"/>
@@ -1695,6 +1460,7 @@
             <w:pPr>
               <w:widowControl w:val="0"/>
               <w:numPr>
+                <w:ilvl w:val="0"/>
                 <w:numId w:val="0"/>
               </w:numPr>
               <w:jc w:val="both"/>
@@ -1726,7 +1492,9 @@
             <w:insideV w:val="single" w:color="auto" w:sz="4" w:space="0"/>
           </w:tblBorders>
           <w:tblCellMar>
+            <w:top w:w="0" w:type="dxa"/>
             <w:left w:w="108" w:type="dxa"/>
+            <w:bottom w:w="0" w:type="dxa"/>
             <w:right w:w="108" w:type="dxa"/>
           </w:tblCellMar>
         </w:tblPrEx>
@@ -1738,6 +1506,7 @@
             <w:pPr>
               <w:widowControl w:val="0"/>
               <w:numPr>
+                <w:ilvl w:val="0"/>
                 <w:numId w:val="0"/>
               </w:numPr>
               <w:jc w:val="both"/>
@@ -1765,6 +1534,7 @@
             <w:pPr>
               <w:widowControl w:val="0"/>
               <w:numPr>
+                <w:ilvl w:val="0"/>
                 <w:numId w:val="0"/>
               </w:numPr>
               <w:jc w:val="both"/>
@@ -1796,7 +1566,9 @@
             <w:insideV w:val="single" w:color="auto" w:sz="4" w:space="0"/>
           </w:tblBorders>
           <w:tblCellMar>
+            <w:top w:w="0" w:type="dxa"/>
             <w:left w:w="108" w:type="dxa"/>
+            <w:bottom w:w="0" w:type="dxa"/>
             <w:right w:w="108" w:type="dxa"/>
           </w:tblCellMar>
         </w:tblPrEx>
@@ -1808,6 +1580,7 @@
             <w:pPr>
               <w:widowControl w:val="0"/>
               <w:numPr>
+                <w:ilvl w:val="0"/>
                 <w:numId w:val="0"/>
               </w:numPr>
               <w:jc w:val="both"/>
@@ -1835,6 +1608,7 @@
             <w:pPr>
               <w:widowControl w:val="0"/>
               <w:numPr>
+                <w:ilvl w:val="0"/>
                 <w:numId w:val="0"/>
               </w:numPr>
               <w:jc w:val="both"/>
@@ -1866,7 +1640,9 @@
             <w:insideV w:val="single" w:color="auto" w:sz="4" w:space="0"/>
           </w:tblBorders>
           <w:tblCellMar>
+            <w:top w:w="0" w:type="dxa"/>
             <w:left w:w="108" w:type="dxa"/>
+            <w:bottom w:w="0" w:type="dxa"/>
             <w:right w:w="108" w:type="dxa"/>
           </w:tblCellMar>
         </w:tblPrEx>
@@ -1878,6 +1654,7 @@
             <w:pPr>
               <w:widowControl w:val="0"/>
               <w:numPr>
+                <w:ilvl w:val="0"/>
                 <w:numId w:val="0"/>
               </w:numPr>
               <w:jc w:val="both"/>
@@ -1905,6 +1682,7 @@
             <w:pPr>
               <w:widowControl w:val="0"/>
               <w:numPr>
+                <w:ilvl w:val="0"/>
                 <w:numId w:val="0"/>
               </w:numPr>
               <w:jc w:val="both"/>
@@ -1936,7 +1714,9 @@
             <w:insideV w:val="single" w:color="auto" w:sz="4" w:space="0"/>
           </w:tblBorders>
           <w:tblCellMar>
+            <w:top w:w="0" w:type="dxa"/>
             <w:left w:w="108" w:type="dxa"/>
+            <w:bottom w:w="0" w:type="dxa"/>
             <w:right w:w="108" w:type="dxa"/>
           </w:tblCellMar>
         </w:tblPrEx>
@@ -1948,6 +1728,7 @@
             <w:pPr>
               <w:widowControl w:val="0"/>
               <w:numPr>
+                <w:ilvl w:val="0"/>
                 <w:numId w:val="0"/>
               </w:numPr>
               <w:jc w:val="both"/>
@@ -1975,6 +1756,7 @@
             <w:pPr>
               <w:widowControl w:val="0"/>
               <w:numPr>
+                <w:ilvl w:val="0"/>
                 <w:numId w:val="0"/>
               </w:numPr>
               <w:jc w:val="both"/>
@@ -2000,6 +1782,7 @@
       <w:pPr>
         <w:widowControl w:val="0"/>
         <w:numPr>
+          <w:ilvl w:val="0"/>
           <w:numId w:val="0"/>
         </w:numPr>
         <w:jc w:val="both"/>
@@ -2023,7 +1806,7 @@
           <w:lang w:val="en-US" w:eastAsia="zh-CN"/>
         </w:rPr>
       </w:pPr>
-      <w:bookmarkStart w:id="5" w:name="_Toc26860"/>
+      <w:bookmarkStart w:id="5" w:name="_Toc23813"/>
       <w:r>
         <w:rPr>
           <w:rFonts w:hint="eastAsia"/>
@@ -2036,6 +1819,7 @@
     <w:p>
       <w:pPr>
         <w:numPr>
+          <w:ilvl w:val="0"/>
           <w:numId w:val="0"/>
         </w:numPr>
         <w:ind w:leftChars="0"/>
@@ -2055,6 +1839,7 @@
     <w:p>
       <w:pPr>
         <w:numPr>
+          <w:ilvl w:val="0"/>
           <w:numId w:val="0"/>
         </w:numPr>
         <w:ind w:leftChars="0"/>
@@ -2067,6 +1852,7 @@
     <w:p>
       <w:pPr>
         <w:numPr>
+          <w:ilvl w:val="0"/>
           <w:numId w:val="0"/>
         </w:numPr>
         <w:ind w:leftChars="0"/>
@@ -2086,6 +1872,7 @@
     <w:p>
       <w:pPr>
         <w:numPr>
+          <w:ilvl w:val="0"/>
           <w:numId w:val="0"/>
         </w:numPr>
         <w:ind w:leftChars="0"/>
@@ -2118,6 +1905,7 @@
     <w:p>
       <w:pPr>
         <w:numPr>
+          <w:ilvl w:val="0"/>
           <w:numId w:val="0"/>
         </w:numPr>
         <w:ind w:leftChars="0"/>
@@ -2137,6 +1925,7 @@
     <w:p>
       <w:pPr>
         <w:numPr>
+          <w:ilvl w:val="0"/>
           <w:numId w:val="0"/>
         </w:numPr>
         <w:ind w:leftChars="0"/>
@@ -2169,6 +1958,7 @@
     <w:p>
       <w:pPr>
         <w:numPr>
+          <w:ilvl w:val="0"/>
           <w:numId w:val="0"/>
         </w:numPr>
         <w:ind w:leftChars="0"/>
@@ -2188,6 +1978,7 @@
     <w:p>
       <w:pPr>
         <w:numPr>
+          <w:ilvl w:val="0"/>
           <w:numId w:val="0"/>
         </w:numPr>
         <w:ind w:leftChars="0"/>
@@ -2220,6 +2011,7 @@
     <w:p>
       <w:pPr>
         <w:numPr>
+          <w:ilvl w:val="0"/>
           <w:numId w:val="0"/>
         </w:numPr>
         <w:ind w:leftChars="0"/>
@@ -2240,6 +2032,7 @@
     <w:p>
       <w:pPr>
         <w:numPr>
+          <w:ilvl w:val="0"/>
           <w:numId w:val="0"/>
         </w:numPr>
         <w:ind w:leftChars="0"/>
@@ -2272,6 +2065,7 @@
     <w:p>
       <w:pPr>
         <w:numPr>
+          <w:ilvl w:val="0"/>
           <w:numId w:val="0"/>
         </w:numPr>
         <w:ind w:leftChars="0"/>
@@ -2291,6 +2085,7 @@
     <w:p>
       <w:pPr>
         <w:numPr>
+          <w:ilvl w:val="0"/>
           <w:numId w:val="0"/>
         </w:numPr>
         <w:ind w:leftChars="0"/>
@@ -2335,7 +2130,9 @@
         </w:tblBorders>
         <w:tblLayout w:type="autofit"/>
         <w:tblCellMar>
+          <w:top w:w="0" w:type="dxa"/>
           <w:left w:w="108" w:type="dxa"/>
+          <w:bottom w:w="0" w:type="dxa"/>
           <w:right w:w="108" w:type="dxa"/>
         </w:tblCellMar>
       </w:tblPr>
@@ -2355,7 +2152,9 @@
             <w:insideV w:val="single" w:color="auto" w:sz="4" w:space="0"/>
           </w:tblBorders>
           <w:tblCellMar>
+            <w:top w:w="0" w:type="dxa"/>
             <w:left w:w="108" w:type="dxa"/>
+            <w:bottom w:w="0" w:type="dxa"/>
             <w:right w:w="108" w:type="dxa"/>
           </w:tblCellMar>
         </w:tblPrEx>
@@ -2366,6 +2165,7 @@
           <w:p>
             <w:pPr>
               <w:numPr>
+                <w:ilvl w:val="0"/>
                 <w:numId w:val="0"/>
               </w:numPr>
               <w:rPr>
@@ -2391,6 +2191,7 @@
           <w:p>
             <w:pPr>
               <w:numPr>
+                <w:ilvl w:val="0"/>
                 <w:numId w:val="0"/>
               </w:numPr>
               <w:rPr>
@@ -2416,6 +2217,7 @@
           <w:p>
             <w:pPr>
               <w:numPr>
+                <w:ilvl w:val="0"/>
                 <w:numId w:val="0"/>
               </w:numPr>
               <w:rPr>
@@ -2446,7 +2248,9 @@
             <w:insideV w:val="single" w:color="auto" w:sz="4" w:space="0"/>
           </w:tblBorders>
           <w:tblCellMar>
+            <w:top w:w="0" w:type="dxa"/>
             <w:left w:w="108" w:type="dxa"/>
+            <w:bottom w:w="0" w:type="dxa"/>
             <w:right w:w="108" w:type="dxa"/>
           </w:tblCellMar>
         </w:tblPrEx>
@@ -2457,6 +2261,7 @@
           <w:p>
             <w:pPr>
               <w:numPr>
+                <w:ilvl w:val="0"/>
                 <w:numId w:val="0"/>
               </w:numPr>
               <w:rPr>
@@ -2482,6 +2287,7 @@
           <w:p>
             <w:pPr>
               <w:numPr>
+                <w:ilvl w:val="0"/>
                 <w:numId w:val="0"/>
               </w:numPr>
               <w:rPr>
@@ -2507,6 +2313,7 @@
           <w:p>
             <w:pPr>
               <w:numPr>
+                <w:ilvl w:val="0"/>
                 <w:numId w:val="0"/>
               </w:numPr>
               <w:rPr>
@@ -2537,7 +2344,9 @@
             <w:insideV w:val="single" w:color="auto" w:sz="4" w:space="0"/>
           </w:tblBorders>
           <w:tblCellMar>
+            <w:top w:w="0" w:type="dxa"/>
             <w:left w:w="108" w:type="dxa"/>
+            <w:bottom w:w="0" w:type="dxa"/>
             <w:right w:w="108" w:type="dxa"/>
           </w:tblCellMar>
         </w:tblPrEx>
@@ -2548,6 +2357,7 @@
           <w:p>
             <w:pPr>
               <w:numPr>
+                <w:ilvl w:val="0"/>
                 <w:numId w:val="0"/>
               </w:numPr>
               <w:rPr>
@@ -2573,6 +2383,7 @@
           <w:p>
             <w:pPr>
               <w:numPr>
+                <w:ilvl w:val="0"/>
                 <w:numId w:val="0"/>
               </w:numPr>
               <w:rPr>
@@ -2598,6 +2409,7 @@
           <w:p>
             <w:pPr>
               <w:numPr>
+                <w:ilvl w:val="0"/>
                 <w:numId w:val="0"/>
               </w:numPr>
               <w:rPr>
@@ -2628,7 +2440,9 @@
             <w:insideV w:val="single" w:color="auto" w:sz="4" w:space="0"/>
           </w:tblBorders>
           <w:tblCellMar>
+            <w:top w:w="0" w:type="dxa"/>
             <w:left w:w="108" w:type="dxa"/>
+            <w:bottom w:w="0" w:type="dxa"/>
             <w:right w:w="108" w:type="dxa"/>
           </w:tblCellMar>
         </w:tblPrEx>
@@ -2639,6 +2453,7 @@
           <w:p>
             <w:pPr>
               <w:numPr>
+                <w:ilvl w:val="0"/>
                 <w:numId w:val="0"/>
               </w:numPr>
               <w:rPr>
@@ -2664,6 +2479,7 @@
           <w:p>
             <w:pPr>
               <w:numPr>
+                <w:ilvl w:val="0"/>
                 <w:numId w:val="0"/>
               </w:numPr>
               <w:rPr>
@@ -2689,6 +2505,7 @@
           <w:p>
             <w:pPr>
               <w:numPr>
+                <w:ilvl w:val="0"/>
                 <w:numId w:val="0"/>
               </w:numPr>
               <w:rPr>
@@ -2719,7 +2536,9 @@
             <w:insideV w:val="single" w:color="auto" w:sz="4" w:space="0"/>
           </w:tblBorders>
           <w:tblCellMar>
+            <w:top w:w="0" w:type="dxa"/>
             <w:left w:w="108" w:type="dxa"/>
+            <w:bottom w:w="0" w:type="dxa"/>
             <w:right w:w="108" w:type="dxa"/>
           </w:tblCellMar>
         </w:tblPrEx>
@@ -2730,6 +2549,7 @@
           <w:p>
             <w:pPr>
               <w:numPr>
+                <w:ilvl w:val="0"/>
                 <w:numId w:val="0"/>
               </w:numPr>
               <w:rPr>
@@ -2755,6 +2575,7 @@
           <w:p>
             <w:pPr>
               <w:numPr>
+                <w:ilvl w:val="0"/>
                 <w:numId w:val="0"/>
               </w:numPr>
               <w:rPr>
@@ -2780,6 +2601,7 @@
           <w:p>
             <w:pPr>
               <w:numPr>
+                <w:ilvl w:val="0"/>
                 <w:numId w:val="0"/>
               </w:numPr>
               <w:rPr>
@@ -2810,7 +2632,9 @@
             <w:insideV w:val="single" w:color="auto" w:sz="4" w:space="0"/>
           </w:tblBorders>
           <w:tblCellMar>
+            <w:top w:w="0" w:type="dxa"/>
             <w:left w:w="108" w:type="dxa"/>
+            <w:bottom w:w="0" w:type="dxa"/>
             <w:right w:w="108" w:type="dxa"/>
           </w:tblCellMar>
         </w:tblPrEx>
@@ -2821,6 +2645,7 @@
           <w:p>
             <w:pPr>
               <w:numPr>
+                <w:ilvl w:val="0"/>
                 <w:numId w:val="0"/>
               </w:numPr>
               <w:rPr>
@@ -2846,6 +2671,7 @@
           <w:p>
             <w:pPr>
               <w:numPr>
+                <w:ilvl w:val="0"/>
                 <w:numId w:val="0"/>
               </w:numPr>
               <w:rPr>
@@ -2871,6 +2697,7 @@
           <w:p>
             <w:pPr>
               <w:numPr>
+                <w:ilvl w:val="0"/>
                 <w:numId w:val="0"/>
               </w:numPr>
               <w:rPr>
@@ -2894,6 +2721,7 @@
     <w:p>
       <w:pPr>
         <w:numPr>
+          <w:ilvl w:val="0"/>
           <w:numId w:val="0"/>
         </w:numPr>
         <w:ind w:leftChars="0"/>
@@ -2916,7 +2744,7 @@
           <w:lang w:val="en-US" w:eastAsia="zh-CN"/>
         </w:rPr>
       </w:pPr>
-      <w:bookmarkStart w:id="6" w:name="_Toc13478"/>
+      <w:bookmarkStart w:id="6" w:name="_Toc18248"/>
       <w:r>
         <w:rPr>
           <w:rFonts w:hint="eastAsia"/>
@@ -3178,7 +3006,7 @@
     <w:lsdException w:qFormat="1" w:unhideWhenUsed="0" w:uiPriority="0" w:semiHidden="0" w:name="Title"/>
     <w:lsdException w:unhideWhenUsed="0" w:uiPriority="0" w:semiHidden="0" w:name="Closing"/>
     <w:lsdException w:unhideWhenUsed="0" w:uiPriority="0" w:semiHidden="0" w:name="Signature"/>
-    <w:lsdException w:unhideWhenUsed="0" w:uiPriority="0" w:name="Default Paragraph Font"/>
+    <w:lsdException w:qFormat="1" w:unhideWhenUsed="0" w:uiPriority="0" w:name="Default Paragraph Font"/>
     <w:lsdException w:unhideWhenUsed="0" w:uiPriority="0" w:semiHidden="0" w:name="Body Text"/>
     <w:lsdException w:unhideWhenUsed="0" w:uiPriority="0" w:semiHidden="0" w:name="Body Text Indent"/>
     <w:lsdException w:unhideWhenUsed="0" w:uiPriority="0" w:semiHidden="0" w:name="List Continue"/>
@@ -3261,7 +3089,7 @@
     <w:lsdException w:unhideWhenUsed="0" w:uiPriority="0" w:semiHidden="0" w:name="Table Web 2"/>
     <w:lsdException w:unhideWhenUsed="0" w:uiPriority="0" w:semiHidden="0" w:name="Table Web 3"/>
     <w:lsdException w:unhideWhenUsed="0" w:uiPriority="0" w:semiHidden="0" w:name="Balloon Text"/>
-    <w:lsdException w:unhideWhenUsed="0" w:uiPriority="0" w:semiHidden="0" w:name="Table Grid"/>
+    <w:lsdException w:qFormat="1" w:unhideWhenUsed="0" w:uiPriority="0" w:semiHidden="0" w:name="Table Grid"/>
     <w:lsdException w:unhideWhenUsed="0" w:uiPriority="0" w:semiHidden="0" w:name="Table Theme"/>
     <w:lsdException w:unhideWhenUsed="0" w:uiPriority="60" w:semiHidden="0" w:name="Light Shading"/>
     <w:lsdException w:unhideWhenUsed="0" w:uiPriority="61" w:semiHidden="0" w:name="Light List"/>
@@ -3436,6 +3264,7 @@
   <w:style w:type="character" w:default="1" w:styleId="9">
     <w:name w:val="Default Paragraph Font"/>
     <w:semiHidden/>
+    <w:qFormat/>
     <w:uiPriority w:val="0"/>
   </w:style>
   <w:style w:type="table" w:default="1" w:styleId="7">
@@ -3469,6 +3298,7 @@
   <w:style w:type="table" w:styleId="8">
     <w:name w:val="Table Grid"/>
     <w:basedOn w:val="7"/>
+    <w:qFormat/>
     <w:uiPriority w:val="0"/>
     <w:pPr>
       <w:widowControl w:val="0"/>

</xml_diff>